<commit_message>
race to bottom blog post
</commit_message>
<xml_diff>
--- a/Quarto/ReportTemplate/test.docx
+++ b/Quarto/ReportTemplate/test.docx
@@ -114,7 +114,7 @@
         <w:pStyle w:val="Date"/>
       </w:pPr>
       <w:r>
-        <w:t xml:space="preserve">2024-06-21</w:t>
+        <w:t xml:space="preserve">2025-04-18</w:t>
       </w:r>
     </w:p>
     <w:sdt>
@@ -490,6 +490,63 @@
         </w:tc>
       </w:tr>
     </w:tbl>
+    <w:tbl>
+      <w:tblPr>
+        <w:tblStyle w:val="Table"/>
+        <w:tblW w:type="auto" w:w="0"/>
+        <w:tblLook w:firstRow="1" w:lastRow="0" w:firstColumn="0" w:lastColumn="0" w:noHBand="0" w:noVBand="0" w:val="0020"/>
+        <w:jc w:val="start"/>
+      </w:tblPr>
+      <w:tblGrid>
+        <w:gridCol w:w="3960"/>
+        <w:gridCol w:w="3960"/>
+      </w:tblGrid>
+      <w:tr>
+        <w:trPr>
+          <w:tblHeader w:val="true"/>
+        </w:trPr>
+        <w:tc>
+          <w:tcPr>
+            <w:gridSpan w:val="2"/>
+          </w:tcPr>
+          <w:p>
+            <w:pPr>
+              <w:pStyle w:val="Compact"/>
+              <w:jc w:val="left"/>
+            </w:pPr>
+            <w:r>
+              <w:t xml:space="preserve">foo</w:t>
+            </w:r>
+          </w:p>
+        </w:tc>
+      </w:tr>
+      <w:tr>
+        <w:tc>
+          <w:tcPr/>
+          <w:p>
+            <w:pPr>
+              <w:pStyle w:val="Compact"/>
+              <w:jc w:val="left"/>
+            </w:pPr>
+            <w:r>
+              <w:t xml:space="preserve">1</w:t>
+            </w:r>
+          </w:p>
+        </w:tc>
+        <w:tc>
+          <w:tcPr/>
+          <w:p>
+            <w:pPr>
+              <w:pStyle w:val="Compact"/>
+              <w:jc w:val="left"/>
+            </w:pPr>
+            <w:r>
+              <w:t xml:space="preserve">2</w:t>
+            </w:r>
+          </w:p>
+        </w:tc>
+      </w:tr>
+    </w:tbl>
     <w:p>
       <w:pPr>
         <w:pStyle w:val="BodyText"/>
@@ -619,7 +676,7 @@
       <w:r>
         <w:drawing>
           <wp:inline>
-            <wp:extent cx="6489700" cy="3352295"/>
+            <wp:extent cx="6489700" cy="3401858"/>
             <wp:effectExtent b="0" l="0" r="0" t="0"/>
             <wp:docPr descr="Label and Whateverlabel with a hyperlink" title="" id="26" name="Picture"/>
             <a:graphic>
@@ -640,7 +697,7 @@
                   <pic:spPr bwMode="auto">
                     <a:xfrm>
                       <a:off x="0" y="0"/>
-                      <a:ext cx="6489700" cy="3352295"/>
+                      <a:ext cx="6489700" cy="3401858"/>
                     </a:xfrm>
                     <a:prstGeom prst="rect">
                       <a:avLst/>
@@ -984,7 +1041,7 @@
             <w:r>
               <w:drawing>
                 <wp:inline>
-                  <wp:extent cx="4024092" cy="3426709"/>
+                  <wp:extent cx="4024092" cy="3430374"/>
                   <wp:effectExtent b="0" l="0" r="0" t="0"/>
                   <wp:docPr descr="Two line plots side by side" title="" id="34" name="Picture"/>
                   <a:graphic>
@@ -1005,7 +1062,7 @@
                         <pic:spPr bwMode="auto">
                           <a:xfrm>
                             <a:off x="0" y="0"/>
-                            <a:ext cx="4024092" cy="3426709"/>
+                            <a:ext cx="4024092" cy="3430374"/>
                           </a:xfrm>
                           <a:prstGeom prst="rect">
                             <a:avLst/>
@@ -1043,7 +1100,7 @@
             <w:r>
               <w:drawing>
                 <wp:inline>
-                  <wp:extent cx="2971800" cy="2556240"/>
+                  <wp:extent cx="2971800" cy="2558974"/>
                   <wp:effectExtent b="0" l="0" r="0" t="0"/>
                   <wp:docPr descr="" title="" id="37" name="Picture"/>
                   <a:graphic>
@@ -1064,7 +1121,7 @@
                         <pic:spPr bwMode="auto">
                           <a:xfrm>
                             <a:off x="0" y="0"/>
-                            <a:ext cx="2971800" cy="2556240"/>
+                            <a:ext cx="2971800" cy="2558974"/>
                           </a:xfrm>
                           <a:prstGeom prst="rect">
                             <a:avLst/>
@@ -1272,7 +1329,7 @@
               <w:jc w:val="right"/>
             </w:pPr>
             <w:r>
-              <w:t xml:space="preserve">0.34</w:t>
+              <w:t xml:space="preserve">0.60</w:t>
             </w:r>
           </w:p>
         </w:tc>
@@ -1298,19 +1355,19 @@
               <w:jc w:val="left"/>
             </w:pPr>
             <w:r>
-              <w:t xml:space="preserve">hacker</w:t>
-            </w:r>
-          </w:p>
-        </w:tc>
-        <w:tc>
-          <w:tcPr/>
-          <w:p>
-            <w:pPr>
-              <w:pStyle w:val="Compact"/>
-              <w:jc w:val="right"/>
-            </w:pPr>
-            <w:r>
-              <w:t xml:space="preserve">0.38</w:t>
+              <w:t xml:space="preserve">whatever</w:t>
+            </w:r>
+          </w:p>
+        </w:tc>
+        <w:tc>
+          <w:tcPr/>
+          <w:p>
+            <w:pPr>
+              <w:pStyle w:val="Compact"/>
+              <w:jc w:val="right"/>
+            </w:pPr>
+            <w:r>
+              <w:t xml:space="preserve">0.43</w:t>
             </w:r>
           </w:p>
         </w:tc>
@@ -1336,19 +1393,19 @@
               <w:jc w:val="left"/>
             </w:pPr>
             <w:r>
-              <w:t xml:space="preserve">whatever</w:t>
-            </w:r>
-          </w:p>
-        </w:tc>
-        <w:tc>
-          <w:tcPr/>
-          <w:p>
-            <w:pPr>
-              <w:pStyle w:val="Compact"/>
-              <w:jc w:val="right"/>
-            </w:pPr>
-            <w:r>
-              <w:t xml:space="preserve">0.80</w:t>
+              <w:t xml:space="preserve">abc</w:t>
+            </w:r>
+          </w:p>
+        </w:tc>
+        <w:tc>
+          <w:tcPr/>
+          <w:p>
+            <w:pPr>
+              <w:pStyle w:val="Compact"/>
+              <w:jc w:val="right"/>
+            </w:pPr>
+            <w:r>
+              <w:t xml:space="preserve">0.18</w:t>
             </w:r>
           </w:p>
         </w:tc>
@@ -1386,7 +1443,7 @@
               <w:jc w:val="right"/>
             </w:pPr>
             <w:r>
-              <w:t xml:space="preserve">0.32</w:t>
+              <w:t xml:space="preserve">0.44</w:t>
             </w:r>
           </w:p>
         </w:tc>
@@ -1412,19 +1469,19 @@
               <w:jc w:val="left"/>
             </w:pPr>
             <w:r>
-              <w:t xml:space="preserve">xyz</w:t>
-            </w:r>
-          </w:p>
-        </w:tc>
-        <w:tc>
-          <w:tcPr/>
-          <w:p>
-            <w:pPr>
-              <w:pStyle w:val="Compact"/>
-              <w:jc w:val="right"/>
-            </w:pPr>
-            <w:r>
-              <w:t xml:space="preserve">0.06</w:t>
+              <w:t xml:space="preserve">hacker</w:t>
+            </w:r>
+          </w:p>
+        </w:tc>
+        <w:tc>
+          <w:tcPr/>
+          <w:p>
+            <w:pPr>
+              <w:pStyle w:val="Compact"/>
+              <w:jc w:val="right"/>
+            </w:pPr>
+            <w:r>
+              <w:t xml:space="preserve">0.72</w:t>
             </w:r>
           </w:p>
         </w:tc>
@@ -1462,7 +1519,7 @@
               <w:jc w:val="right"/>
             </w:pPr>
             <w:r>
-              <w:t xml:space="preserve">0.19</w:t>
+              <w:t xml:space="preserve">0.53</w:t>
             </w:r>
           </w:p>
         </w:tc>
@@ -1500,7 +1557,7 @@
               <w:jc w:val="right"/>
             </w:pPr>
             <w:r>
-              <w:t xml:space="preserve">0.49</w:t>
+              <w:t xml:space="preserve">0.78</w:t>
             </w:r>
           </w:p>
         </w:tc>
@@ -1526,19 +1583,19 @@
               <w:jc w:val="left"/>
             </w:pPr>
             <w:r>
-              <w:t xml:space="preserve">xyz</w:t>
-            </w:r>
-          </w:p>
-        </w:tc>
-        <w:tc>
-          <w:tcPr/>
-          <w:p>
-            <w:pPr>
-              <w:pStyle w:val="Compact"/>
-              <w:jc w:val="right"/>
-            </w:pPr>
-            <w:r>
-              <w:t xml:space="preserve">0.55</w:t>
+              <w:t xml:space="preserve">hacker</w:t>
+            </w:r>
+          </w:p>
+        </w:tc>
+        <w:tc>
+          <w:tcPr/>
+          <w:p>
+            <w:pPr>
+              <w:pStyle w:val="Compact"/>
+              <w:jc w:val="right"/>
+            </w:pPr>
+            <w:r>
+              <w:t xml:space="preserve">0.97</w:t>
             </w:r>
           </w:p>
         </w:tc>
@@ -1564,19 +1621,19 @@
               <w:jc w:val="left"/>
             </w:pPr>
             <w:r>
-              <w:t xml:space="preserve">hacker</w:t>
-            </w:r>
-          </w:p>
-        </w:tc>
-        <w:tc>
-          <w:tcPr/>
-          <w:p>
-            <w:pPr>
-              <w:pStyle w:val="Compact"/>
-              <w:jc w:val="right"/>
-            </w:pPr>
-            <w:r>
-              <w:t xml:space="preserve">0.73</w:t>
+              <w:t xml:space="preserve">abc</w:t>
+            </w:r>
+          </w:p>
+        </w:tc>
+        <w:tc>
+          <w:tcPr/>
+          <w:p>
+            <w:pPr>
+              <w:pStyle w:val="Compact"/>
+              <w:jc w:val="right"/>
+            </w:pPr>
+            <w:r>
+              <w:t xml:space="preserve">0.99</w:t>
             </w:r>
           </w:p>
         </w:tc>
@@ -1614,7 +1671,7 @@
               <w:jc w:val="right"/>
             </w:pPr>
             <w:r>
-              <w:t xml:space="preserve">0.73</w:t>
+              <w:t xml:space="preserve">0.54</w:t>
             </w:r>
           </w:p>
         </w:tc>
@@ -1652,7 +1709,7 @@
               <w:jc w:val="right"/>
             </w:pPr>
             <w:r>
-              <w:t xml:space="preserve">0.79</w:t>
+              <w:t xml:space="preserve">0.86</w:t>
             </w:r>
           </w:p>
         </w:tc>
@@ -1678,19 +1735,19 @@
               <w:jc w:val="left"/>
             </w:pPr>
             <w:r>
-              <w:t xml:space="preserve">abc</w:t>
-            </w:r>
-          </w:p>
-        </w:tc>
-        <w:tc>
-          <w:tcPr/>
-          <w:p>
-            <w:pPr>
-              <w:pStyle w:val="Compact"/>
-              <w:jc w:val="right"/>
-            </w:pPr>
-            <w:r>
-              <w:t xml:space="preserve">0.56</w:t>
+              <w:t xml:space="preserve">xyz</w:t>
+            </w:r>
+          </w:p>
+        </w:tc>
+        <w:tc>
+          <w:tcPr/>
+          <w:p>
+            <w:pPr>
+              <w:pStyle w:val="Compact"/>
+              <w:jc w:val="right"/>
+            </w:pPr>
+            <w:r>
+              <w:t xml:space="preserve">0.17</w:t>
             </w:r>
           </w:p>
         </w:tc>
@@ -1716,19 +1773,19 @@
               <w:jc w:val="left"/>
             </w:pPr>
             <w:r>
-              <w:t xml:space="preserve">abc</w:t>
-            </w:r>
-          </w:p>
-        </w:tc>
-        <w:tc>
-          <w:tcPr/>
-          <w:p>
-            <w:pPr>
-              <w:pStyle w:val="Compact"/>
-              <w:jc w:val="right"/>
-            </w:pPr>
-            <w:r>
-              <w:t xml:space="preserve">0.05</w:t>
+              <w:t xml:space="preserve">xyz</w:t>
+            </w:r>
+          </w:p>
+        </w:tc>
+        <w:tc>
+          <w:tcPr/>
+          <w:p>
+            <w:pPr>
+              <w:pStyle w:val="Compact"/>
+              <w:jc w:val="right"/>
+            </w:pPr>
+            <w:r>
+              <w:t xml:space="preserve">0.65</w:t>
             </w:r>
           </w:p>
         </w:tc>
@@ -1754,19 +1811,19 @@
               <w:jc w:val="left"/>
             </w:pPr>
             <w:r>
-              <w:t xml:space="preserve">whatever</w:t>
-            </w:r>
-          </w:p>
-        </w:tc>
-        <w:tc>
-          <w:tcPr/>
-          <w:p>
-            <w:pPr>
-              <w:pStyle w:val="Compact"/>
-              <w:jc w:val="right"/>
-            </w:pPr>
-            <w:r>
-              <w:t xml:space="preserve">0.94</w:t>
+              <w:t xml:space="preserve">toolegit</w:t>
+            </w:r>
+          </w:p>
+        </w:tc>
+        <w:tc>
+          <w:tcPr/>
+          <w:p>
+            <w:pPr>
+              <w:pStyle w:val="Compact"/>
+              <w:jc w:val="right"/>
+            </w:pPr>
+            <w:r>
+              <w:t xml:space="preserve">0.19</w:t>
             </w:r>
           </w:p>
         </w:tc>
@@ -1792,19 +1849,19 @@
               <w:jc w:val="left"/>
             </w:pPr>
             <w:r>
-              <w:t xml:space="preserve">abc</w:t>
-            </w:r>
-          </w:p>
-        </w:tc>
-        <w:tc>
-          <w:tcPr/>
-          <w:p>
-            <w:pPr>
-              <w:pStyle w:val="Compact"/>
-              <w:jc w:val="right"/>
-            </w:pPr>
-            <w:r>
-              <w:t xml:space="preserve">0.09</w:t>
+              <w:t xml:space="preserve">toolegit</w:t>
+            </w:r>
+          </w:p>
+        </w:tc>
+        <w:tc>
+          <w:tcPr/>
+          <w:p>
+            <w:pPr>
+              <w:pStyle w:val="Compact"/>
+              <w:jc w:val="right"/>
+            </w:pPr>
+            <w:r>
+              <w:t xml:space="preserve">0.85</w:t>
             </w:r>
           </w:p>
         </w:tc>
@@ -1830,19 +1887,19 @@
               <w:jc w:val="left"/>
             </w:pPr>
             <w:r>
-              <w:t xml:space="preserve">abc</w:t>
-            </w:r>
-          </w:p>
-        </w:tc>
-        <w:tc>
-          <w:tcPr/>
-          <w:p>
-            <w:pPr>
-              <w:pStyle w:val="Compact"/>
-              <w:jc w:val="right"/>
-            </w:pPr>
-            <w:r>
-              <w:t xml:space="preserve">0.89</w:t>
+              <w:t xml:space="preserve">whatever</w:t>
+            </w:r>
+          </w:p>
+        </w:tc>
+        <w:tc>
+          <w:tcPr/>
+          <w:p>
+            <w:pPr>
+              <w:pStyle w:val="Compact"/>
+              <w:jc w:val="right"/>
+            </w:pPr>
+            <w:r>
+              <w:t xml:space="preserve">0.69</w:t>
             </w:r>
           </w:p>
         </w:tc>
@@ -1880,7 +1937,7 @@
               <w:jc w:val="right"/>
             </w:pPr>
             <w:r>
-              <w:t xml:space="preserve">0.17</w:t>
+              <w:t xml:space="preserve">0.89</w:t>
             </w:r>
           </w:p>
         </w:tc>
@@ -1906,19 +1963,19 @@
               <w:jc w:val="left"/>
             </w:pPr>
             <w:r>
-              <w:t xml:space="preserve">hacker</w:t>
-            </w:r>
-          </w:p>
-        </w:tc>
-        <w:tc>
-          <w:tcPr/>
-          <w:p>
-            <w:pPr>
-              <w:pStyle w:val="Compact"/>
-              <w:jc w:val="right"/>
-            </w:pPr>
-            <w:r>
-              <w:t xml:space="preserve">0.78</w:t>
+              <w:t xml:space="preserve">abc</w:t>
+            </w:r>
+          </w:p>
+        </w:tc>
+        <w:tc>
+          <w:tcPr/>
+          <w:p>
+            <w:pPr>
+              <w:pStyle w:val="Compact"/>
+              <w:jc w:val="right"/>
+            </w:pPr>
+            <w:r>
+              <w:t xml:space="preserve">0.21</w:t>
             </w:r>
           </w:p>
         </w:tc>
@@ -1944,19 +2001,19 @@
               <w:jc w:val="left"/>
             </w:pPr>
             <w:r>
-              <w:t xml:space="preserve">whatever</w:t>
-            </w:r>
-          </w:p>
-        </w:tc>
-        <w:tc>
-          <w:tcPr/>
-          <w:p>
-            <w:pPr>
-              <w:pStyle w:val="Compact"/>
-              <w:jc w:val="right"/>
-            </w:pPr>
-            <w:r>
-              <w:t xml:space="preserve">0.37</w:t>
+              <w:t xml:space="preserve">toolegit</w:t>
+            </w:r>
+          </w:p>
+        </w:tc>
+        <w:tc>
+          <w:tcPr/>
+          <w:p>
+            <w:pPr>
+              <w:pStyle w:val="Compact"/>
+              <w:jc w:val="right"/>
+            </w:pPr>
+            <w:r>
+              <w:t xml:space="preserve">0.71</w:t>
             </w:r>
           </w:p>
         </w:tc>
@@ -1982,19 +2039,19 @@
               <w:jc w:val="left"/>
             </w:pPr>
             <w:r>
-              <w:t xml:space="preserve">whatever</w:t>
-            </w:r>
-          </w:p>
-        </w:tc>
-        <w:tc>
-          <w:tcPr/>
-          <w:p>
-            <w:pPr>
-              <w:pStyle w:val="Compact"/>
-              <w:jc w:val="right"/>
-            </w:pPr>
-            <w:r>
-              <w:t xml:space="preserve">0.42</w:t>
+              <w:t xml:space="preserve">hacker</w:t>
+            </w:r>
+          </w:p>
+        </w:tc>
+        <w:tc>
+          <w:tcPr/>
+          <w:p>
+            <w:pPr>
+              <w:pStyle w:val="Compact"/>
+              <w:jc w:val="right"/>
+            </w:pPr>
+            <w:r>
+              <w:t xml:space="preserve">0.97</w:t>
             </w:r>
           </w:p>
         </w:tc>
@@ -2020,19 +2077,19 @@
               <w:jc w:val="left"/>
             </w:pPr>
             <w:r>
-              <w:t xml:space="preserve">abc</w:t>
-            </w:r>
-          </w:p>
-        </w:tc>
-        <w:tc>
-          <w:tcPr/>
-          <w:p>
-            <w:pPr>
-              <w:pStyle w:val="Compact"/>
-              <w:jc w:val="right"/>
-            </w:pPr>
-            <w:r>
-              <w:t xml:space="preserve">0.99</w:t>
+              <w:t xml:space="preserve">xyz</w:t>
+            </w:r>
+          </w:p>
+        </w:tc>
+        <w:tc>
+          <w:tcPr/>
+          <w:p>
+            <w:pPr>
+              <w:pStyle w:val="Compact"/>
+              <w:jc w:val="right"/>
+            </w:pPr>
+            <w:r>
+              <w:t xml:space="preserve">0.98</w:t>
             </w:r>
           </w:p>
         </w:tc>
@@ -2058,19 +2115,19 @@
               <w:jc w:val="left"/>
             </w:pPr>
             <w:r>
-              <w:t xml:space="preserve">xyz</w:t>
-            </w:r>
-          </w:p>
-        </w:tc>
-        <w:tc>
-          <w:tcPr/>
-          <w:p>
-            <w:pPr>
-              <w:pStyle w:val="Compact"/>
-              <w:jc w:val="right"/>
-            </w:pPr>
-            <w:r>
-              <w:t xml:space="preserve">0.59</w:t>
+              <w:t xml:space="preserve">hacker</w:t>
+            </w:r>
+          </w:p>
+        </w:tc>
+        <w:tc>
+          <w:tcPr/>
+          <w:p>
+            <w:pPr>
+              <w:pStyle w:val="Compact"/>
+              <w:jc w:val="right"/>
+            </w:pPr>
+            <w:r>
+              <w:t xml:space="preserve">0.11</w:t>
             </w:r>
           </w:p>
         </w:tc>
@@ -2108,7 +2165,7 @@
               <w:jc w:val="right"/>
             </w:pPr>
             <w:r>
-              <w:t xml:space="preserve">0.02</w:t>
+              <w:t xml:space="preserve">0.70</w:t>
             </w:r>
           </w:p>
         </w:tc>
@@ -2134,19 +2191,19 @@
               <w:jc w:val="left"/>
             </w:pPr>
             <w:r>
-              <w:t xml:space="preserve">toolegit</w:t>
-            </w:r>
-          </w:p>
-        </w:tc>
-        <w:tc>
-          <w:tcPr/>
-          <w:p>
-            <w:pPr>
-              <w:pStyle w:val="Compact"/>
-              <w:jc w:val="right"/>
-            </w:pPr>
-            <w:r>
-              <w:t xml:space="preserve">0.36</w:t>
+              <w:t xml:space="preserve">abc</w:t>
+            </w:r>
+          </w:p>
+        </w:tc>
+        <w:tc>
+          <w:tcPr/>
+          <w:p>
+            <w:pPr>
+              <w:pStyle w:val="Compact"/>
+              <w:jc w:val="right"/>
+            </w:pPr>
+            <w:r>
+              <w:t xml:space="preserve">0.23</w:t>
             </w:r>
           </w:p>
         </w:tc>
@@ -2172,19 +2229,19 @@
               <w:jc w:val="left"/>
             </w:pPr>
             <w:r>
-              <w:t xml:space="preserve">xyz</w:t>
-            </w:r>
-          </w:p>
-        </w:tc>
-        <w:tc>
-          <w:tcPr/>
-          <w:p>
-            <w:pPr>
-              <w:pStyle w:val="Compact"/>
-              <w:jc w:val="right"/>
-            </w:pPr>
-            <w:r>
-              <w:t xml:space="preserve">0.07</w:t>
+              <w:t xml:space="preserve">abc</w:t>
+            </w:r>
+          </w:p>
+        </w:tc>
+        <w:tc>
+          <w:tcPr/>
+          <w:p>
+            <w:pPr>
+              <w:pStyle w:val="Compact"/>
+              <w:jc w:val="right"/>
+            </w:pPr>
+            <w:r>
+              <w:t xml:space="preserve">0.49</w:t>
             </w:r>
           </w:p>
         </w:tc>
@@ -2210,19 +2267,19 @@
               <w:jc w:val="left"/>
             </w:pPr>
             <w:r>
-              <w:t xml:space="preserve">whatever</w:t>
-            </w:r>
-          </w:p>
-        </w:tc>
-        <w:tc>
-          <w:tcPr/>
-          <w:p>
-            <w:pPr>
-              <w:pStyle w:val="Compact"/>
-              <w:jc w:val="right"/>
-            </w:pPr>
-            <w:r>
-              <w:t xml:space="preserve">0.03</w:t>
+              <w:t xml:space="preserve">toolegit</w:t>
+            </w:r>
+          </w:p>
+        </w:tc>
+        <w:tc>
+          <w:tcPr/>
+          <w:p>
+            <w:pPr>
+              <w:pStyle w:val="Compact"/>
+              <w:jc w:val="right"/>
+            </w:pPr>
+            <w:r>
+              <w:t xml:space="preserve">0.51</w:t>
             </w:r>
           </w:p>
         </w:tc>
@@ -2248,19 +2305,19 @@
               <w:jc w:val="left"/>
             </w:pPr>
             <w:r>
-              <w:t xml:space="preserve">whatever</w:t>
-            </w:r>
-          </w:p>
-        </w:tc>
-        <w:tc>
-          <w:tcPr/>
-          <w:p>
-            <w:pPr>
-              <w:pStyle w:val="Compact"/>
-              <w:jc w:val="right"/>
-            </w:pPr>
-            <w:r>
-              <w:t xml:space="preserve">0.53</w:t>
+              <w:t xml:space="preserve">hacker</w:t>
+            </w:r>
+          </w:p>
+        </w:tc>
+        <w:tc>
+          <w:tcPr/>
+          <w:p>
+            <w:pPr>
+              <w:pStyle w:val="Compact"/>
+              <w:jc w:val="right"/>
+            </w:pPr>
+            <w:r>
+              <w:t xml:space="preserve">0.30</w:t>
             </w:r>
           </w:p>
         </w:tc>
@@ -2298,7 +2355,7 @@
               <w:jc w:val="right"/>
             </w:pPr>
             <w:r>
-              <w:t xml:space="preserve">0.02</w:t>
+              <w:t xml:space="preserve">0.07</w:t>
             </w:r>
           </w:p>
         </w:tc>
@@ -2336,7 +2393,7 @@
               <w:jc w:val="right"/>
             </w:pPr>
             <w:r>
-              <w:t xml:space="preserve">0.42</w:t>
+              <w:t xml:space="preserve">0.06</w:t>
             </w:r>
           </w:p>
         </w:tc>
@@ -2362,19 +2419,19 @@
               <w:jc w:val="left"/>
             </w:pPr>
             <w:r>
-              <w:t xml:space="preserve">abc</w:t>
-            </w:r>
-          </w:p>
-        </w:tc>
-        <w:tc>
-          <w:tcPr/>
-          <w:p>
-            <w:pPr>
-              <w:pStyle w:val="Compact"/>
-              <w:jc w:val="right"/>
-            </w:pPr>
-            <w:r>
-              <w:t xml:space="preserve">0.87</w:t>
+              <w:t xml:space="preserve">xyz</w:t>
+            </w:r>
+          </w:p>
+        </w:tc>
+        <w:tc>
+          <w:tcPr/>
+          <w:p>
+            <w:pPr>
+              <w:pStyle w:val="Compact"/>
+              <w:jc w:val="right"/>
+            </w:pPr>
+            <w:r>
+              <w:t xml:space="preserve">0.35</w:t>
             </w:r>
           </w:p>
         </w:tc>
@@ -2400,19 +2457,19 @@
               <w:jc w:val="left"/>
             </w:pPr>
             <w:r>
-              <w:t xml:space="preserve">toolegit</w:t>
-            </w:r>
-          </w:p>
-        </w:tc>
-        <w:tc>
-          <w:tcPr/>
-          <w:p>
-            <w:pPr>
-              <w:pStyle w:val="Compact"/>
-              <w:jc w:val="right"/>
-            </w:pPr>
-            <w:r>
-              <w:t xml:space="preserve">0.15</w:t>
+              <w:t xml:space="preserve">xyz</w:t>
+            </w:r>
+          </w:p>
+        </w:tc>
+        <w:tc>
+          <w:tcPr/>
+          <w:p>
+            <w:pPr>
+              <w:pStyle w:val="Compact"/>
+              <w:jc w:val="right"/>
+            </w:pPr>
+            <w:r>
+              <w:t xml:space="preserve">0.64</w:t>
             </w:r>
           </w:p>
         </w:tc>
@@ -2450,7 +2507,7 @@
               <w:jc w:val="right"/>
             </w:pPr>
             <w:r>
-              <w:t xml:space="preserve">0.47</w:t>
+              <w:t xml:space="preserve">0.84</w:t>
             </w:r>
           </w:p>
         </w:tc>
@@ -2476,19 +2533,19 @@
               <w:jc w:val="left"/>
             </w:pPr>
             <w:r>
-              <w:t xml:space="preserve">xyz</w:t>
-            </w:r>
-          </w:p>
-        </w:tc>
-        <w:tc>
-          <w:tcPr/>
-          <w:p>
-            <w:pPr>
-              <w:pStyle w:val="Compact"/>
-              <w:jc w:val="right"/>
-            </w:pPr>
-            <w:r>
-              <w:t xml:space="preserve">0.07</w:t>
+              <w:t xml:space="preserve">abc</w:t>
+            </w:r>
+          </w:p>
+        </w:tc>
+        <w:tc>
+          <w:tcPr/>
+          <w:p>
+            <w:pPr>
+              <w:pStyle w:val="Compact"/>
+              <w:jc w:val="right"/>
+            </w:pPr>
+            <w:r>
+              <w:t xml:space="preserve">0.67</w:t>
             </w:r>
           </w:p>
         </w:tc>
@@ -2526,7 +2583,7 @@
               <w:jc w:val="right"/>
             </w:pPr>
             <w:r>
-              <w:t xml:space="preserve">0.87</w:t>
+              <w:t xml:space="preserve">0.13</w:t>
             </w:r>
           </w:p>
         </w:tc>
@@ -2552,19 +2609,19 @@
               <w:jc w:val="left"/>
             </w:pPr>
             <w:r>
-              <w:t xml:space="preserve">whatever</w:t>
-            </w:r>
-          </w:p>
-        </w:tc>
-        <w:tc>
-          <w:tcPr/>
-          <w:p>
-            <w:pPr>
-              <w:pStyle w:val="Compact"/>
-              <w:jc w:val="right"/>
-            </w:pPr>
-            <w:r>
-              <w:t xml:space="preserve">0.36</w:t>
+              <w:t xml:space="preserve">hacker</w:t>
+            </w:r>
+          </w:p>
+        </w:tc>
+        <w:tc>
+          <w:tcPr/>
+          <w:p>
+            <w:pPr>
+              <w:pStyle w:val="Compact"/>
+              <w:jc w:val="right"/>
+            </w:pPr>
+            <w:r>
+              <w:t xml:space="preserve">0.23</w:t>
             </w:r>
           </w:p>
         </w:tc>
@@ -2602,7 +2659,7 @@
               <w:jc w:val="right"/>
             </w:pPr>
             <w:r>
-              <w:t xml:space="preserve">0.01</w:t>
+              <w:t xml:space="preserve">0.49</w:t>
             </w:r>
           </w:p>
         </w:tc>
@@ -2628,19 +2685,19 @@
               <w:jc w:val="left"/>
             </w:pPr>
             <w:r>
-              <w:t xml:space="preserve">abc</w:t>
-            </w:r>
-          </w:p>
-        </w:tc>
-        <w:tc>
-          <w:tcPr/>
-          <w:p>
-            <w:pPr>
-              <w:pStyle w:val="Compact"/>
-              <w:jc w:val="right"/>
-            </w:pPr>
-            <w:r>
-              <w:t xml:space="preserve">0.83</w:t>
+              <w:t xml:space="preserve">hacker</w:t>
+            </w:r>
+          </w:p>
+        </w:tc>
+        <w:tc>
+          <w:tcPr/>
+          <w:p>
+            <w:pPr>
+              <w:pStyle w:val="Compact"/>
+              <w:jc w:val="right"/>
+            </w:pPr>
+            <w:r>
+              <w:t xml:space="preserve">0.93</w:t>
             </w:r>
           </w:p>
         </w:tc>
@@ -2666,19 +2723,19 @@
               <w:jc w:val="left"/>
             </w:pPr>
             <w:r>
-              <w:t xml:space="preserve">whatever</w:t>
-            </w:r>
-          </w:p>
-        </w:tc>
-        <w:tc>
-          <w:tcPr/>
-          <w:p>
-            <w:pPr>
-              <w:pStyle w:val="Compact"/>
-              <w:jc w:val="right"/>
-            </w:pPr>
-            <w:r>
-              <w:t xml:space="preserve">0.45</w:t>
+              <w:t xml:space="preserve">xyz</w:t>
+            </w:r>
+          </w:p>
+        </w:tc>
+        <w:tc>
+          <w:tcPr/>
+          <w:p>
+            <w:pPr>
+              <w:pStyle w:val="Compact"/>
+              <w:jc w:val="right"/>
+            </w:pPr>
+            <w:r>
+              <w:t xml:space="preserve">0.68</w:t>
             </w:r>
           </w:p>
         </w:tc>
@@ -2716,7 +2773,7 @@
               <w:jc w:val="right"/>
             </w:pPr>
             <w:r>
-              <w:t xml:space="preserve">0.31</w:t>
+              <w:t xml:space="preserve">0.77</w:t>
             </w:r>
           </w:p>
         </w:tc>
@@ -2742,19 +2799,19 @@
               <w:jc w:val="left"/>
             </w:pPr>
             <w:r>
-              <w:t xml:space="preserve">abc</w:t>
-            </w:r>
-          </w:p>
-        </w:tc>
-        <w:tc>
-          <w:tcPr/>
-          <w:p>
-            <w:pPr>
-              <w:pStyle w:val="Compact"/>
-              <w:jc w:val="right"/>
-            </w:pPr>
-            <w:r>
-              <w:t xml:space="preserve">0.97</w:t>
+              <w:t xml:space="preserve">whatever</w:t>
+            </w:r>
+          </w:p>
+        </w:tc>
+        <w:tc>
+          <w:tcPr/>
+          <w:p>
+            <w:pPr>
+              <w:pStyle w:val="Compact"/>
+              <w:jc w:val="right"/>
+            </w:pPr>
+            <w:r>
+              <w:t xml:space="preserve">0.25</w:t>
             </w:r>
           </w:p>
         </w:tc>

</xml_diff>